<commit_message>
docs: trim a repeated word in the usability appendix
</commit_message>
<xml_diff>
--- a/docs/docx/usability-evaluation.docx
+++ b/docs/docx/usability-evaluation.docx
@@ -2127,7 +2127,7 @@
           <w:color w:val="1B3A6B"/>
           <w:sz w:val="26"/>
         </w:rPr>
-        <w:t>5. Limitations, honestly</w:t>
+        <w:t>5. What we did not do</w:t>
       </w:r>
     </w:p>
     <w:p>
@@ -2292,7 +2292,7 @@
         <w:spacing w:after="120"/>
       </w:pPr>
       <w:r>
-        <w:t>issues, each open one with a tested replacement value ready to apply. The honest</w:t>
+        <w:t>issues, each open one with a tested replacement value ready to apply. The gap</w:t>
       </w:r>
     </w:p>
     <w:p>
@@ -2300,7 +2300,7 @@
         <w:spacing w:after="120"/>
       </w:pPr>
       <w:r>
-        <w:t>gap is moderated testing with real compliance users, which needs access we do</w:t>
+        <w:t>that matters is moderated testing with real compliance users, which needs access</w:t>
       </w:r>
     </w:p>
     <w:p>
@@ -2308,7 +2308,7 @@
         <w:spacing w:after="120"/>
       </w:pPr>
       <w:r>
-        <w:t>not have this session and is flagged for A5.</w:t>
+        <w:t>we do not have this session and is flagged for A5.</w:t>
       </w:r>
     </w:p>
     <w:sectPr>

</xml_diff>